<commit_message>
Improve Week 4 runbook formatting
</commit_message>
<xml_diff>
--- a/week-04/Week_04_Storage_Databases_Runbook_Clear.docx
+++ b/week-04/Week_04_Storage_Databases_Runbook_Clear.docx
@@ -8,12 +8,20 @@
       </w:pPr>
       <w:r>
         <w:rPr>
-          <w:rFonts w:ascii="Segoe Print" w:hAnsi="Segoe Print"/>
           <w:b/>
-          <w:color w:val="23537A"/>
-          <w:sz w:val="44"/>
+          <w:color w:val="007096"/>
+          <w:sz w:val="22"/>
         </w:rPr>
-        <w:t>WEEK 4 — STORAGE &amp; DATABASES RUNBOOK</w:t>
+        <w:t>WEEK 04</w:t>
+      </w:r>
+    </w:p>
+    <w:p>
+      <w:pPr>
+        <w:pStyle w:val="Title"/>
+        <w:jc w:val="center"/>
+      </w:pPr>
+      <w:r>
+        <w:t>Storage &amp; Databases</w:t>
       </w:r>
     </w:p>
     <w:p>
@@ -23,8 +31,21 @@
       <w:r>
         <w:rPr>
           <w:i/>
+          <w:color w:val="5A646E"/>
+          <w:sz w:val="22"/>
         </w:rPr>
-        <w:t>AWS Cloud Engineer Journey | IDX Exchange</w:t>
+        <w:t>AWS Cloud Engineer Internship  |  PropertyLite</w:t>
+      </w:r>
+    </w:p>
+    <w:p>
+      <w:pPr>
+        <w:jc w:val="center"/>
+      </w:pPr>
+      <w:r>
+        <w:rPr>
+          <w:b/>
+        </w:rPr>
+        <w:t>AWS Region: us-east-1 (US East — N. Virginia)</w:t>
       </w:r>
     </w:p>
     <w:p>
@@ -32,66 +53,357 @@
         <w:pStyle w:val="Heading1"/>
       </w:pPr>
       <w:r>
-        <w:t>Overview</w:t>
+        <w:t>1. Lab Overview</w:t>
       </w:r>
     </w:p>
     <w:p>
       <w:r>
-        <w:t>In Week 4, I practiced AWS storage and database services. I used a temporary EC2 client to connect to an Amazon RDS for MySQL database, created and tested a DynamoDB table with a sample item, and created an S3 bucket to store a runbook file. I also configured an S3 lifecycle rule and performed cleanup to avoid leaving lab resources running.</w:t>
+        <w:t>Objective: Practice object storage with Amazon S3, relational database connectivity with Amazon RDS, and NoSQL item retrieval with Amazon DynamoDB.</w:t>
       </w:r>
+    </w:p>
+    <w:tbl>
+      <w:tblPr>
+        <w:tblStyle w:val="TableGrid"/>
+        <w:tblW w:type="auto" w:w="0"/>
+        <w:jc w:val="center"/>
+        <w:tblLook w:firstColumn="1" w:firstRow="1" w:lastColumn="0" w:lastRow="0" w:noHBand="0" w:noVBand="1" w:val="04A0"/>
+      </w:tblPr>
+      <w:tblGrid>
+        <w:gridCol w:w="3360"/>
+        <w:gridCol w:w="3360"/>
+        <w:gridCol w:w="3360"/>
+      </w:tblGrid>
+      <w:tr>
+        <w:tc>
+          <w:tcPr>
+            <w:tcW w:type="dxa" w:w="3360"/>
+            <w:vAlign w:val="center"/>
+            <w:shd w:fill="143F69"/>
+          </w:tcPr>
+          <w:p>
+            <w:pPr>
+              <w:spacing w:after="40"/>
+            </w:pPr>
+            <w:r/>
+            <w:r>
+              <w:rPr>
+                <w:b/>
+                <w:color w:val="FFFFFF"/>
+                <w:sz w:val="18"/>
+              </w:rPr>
+              <w:t>Lab</w:t>
+            </w:r>
+          </w:p>
+        </w:tc>
+        <w:tc>
+          <w:tcPr>
+            <w:tcW w:type="dxa" w:w="3360"/>
+            <w:vAlign w:val="center"/>
+            <w:shd w:fill="143F69"/>
+          </w:tcPr>
+          <w:p>
+            <w:pPr>
+              <w:spacing w:after="40"/>
+            </w:pPr>
+            <w:r/>
+            <w:r>
+              <w:rPr>
+                <w:b/>
+                <w:color w:val="FFFFFF"/>
+                <w:sz w:val="18"/>
+              </w:rPr>
+              <w:t>Service</w:t>
+            </w:r>
+          </w:p>
+        </w:tc>
+        <w:tc>
+          <w:tcPr>
+            <w:tcW w:type="dxa" w:w="3360"/>
+            <w:vAlign w:val="center"/>
+            <w:shd w:fill="143F69"/>
+          </w:tcPr>
+          <w:p>
+            <w:pPr>
+              <w:spacing w:after="40"/>
+            </w:pPr>
+            <w:r/>
+            <w:r>
+              <w:rPr>
+                <w:b/>
+                <w:color w:val="FFFFFF"/>
+                <w:sz w:val="18"/>
+              </w:rPr>
+              <w:t>Practice</w:t>
+            </w:r>
+          </w:p>
+        </w:tc>
+      </w:tr>
+      <w:tr>
+        <w:tc>
+          <w:tcPr>
+            <w:tcW w:type="dxa" w:w="3360"/>
+            <w:vAlign w:val="center"/>
+          </w:tcPr>
+          <w:p>
+            <w:pPr>
+              <w:spacing w:after="40"/>
+            </w:pPr>
+            <w:r/>
+            <w:r>
+              <w:rPr>
+                <w:b w:val="0"/>
+                <w:sz w:val="18"/>
+              </w:rPr>
+              <w:t>4.1</w:t>
+            </w:r>
+          </w:p>
+        </w:tc>
+        <w:tc>
+          <w:tcPr>
+            <w:tcW w:type="dxa" w:w="3360"/>
+            <w:vAlign w:val="center"/>
+          </w:tcPr>
+          <w:p>
+            <w:pPr>
+              <w:spacing w:after="40"/>
+            </w:pPr>
+            <w:r/>
+            <w:r>
+              <w:rPr>
+                <w:b w:val="0"/>
+                <w:sz w:val="18"/>
+              </w:rPr>
+              <w:t>Amazon S3</w:t>
+            </w:r>
+          </w:p>
+        </w:tc>
+        <w:tc>
+          <w:tcPr>
+            <w:tcW w:type="dxa" w:w="3360"/>
+            <w:vAlign w:val="center"/>
+          </w:tcPr>
+          <w:p>
+            <w:pPr>
+              <w:spacing w:after="40"/>
+            </w:pPr>
+            <w:r/>
+            <w:r>
+              <w:rPr>
+                <w:b w:val="0"/>
+                <w:sz w:val="18"/>
+              </w:rPr>
+              <w:t>Bucket, object upload, lifecycle rule, cleanup</w:t>
+            </w:r>
+          </w:p>
+        </w:tc>
+      </w:tr>
+      <w:tr>
+        <w:tc>
+          <w:tcPr>
+            <w:tcW w:type="dxa" w:w="3360"/>
+            <w:vAlign w:val="center"/>
+            <w:shd w:fill="EEF4F8"/>
+          </w:tcPr>
+          <w:p>
+            <w:pPr>
+              <w:spacing w:after="40"/>
+            </w:pPr>
+            <w:r/>
+            <w:r>
+              <w:rPr>
+                <w:b w:val="0"/>
+                <w:sz w:val="18"/>
+              </w:rPr>
+              <w:t>4.2</w:t>
+            </w:r>
+          </w:p>
+        </w:tc>
+        <w:tc>
+          <w:tcPr>
+            <w:tcW w:type="dxa" w:w="3360"/>
+            <w:vAlign w:val="center"/>
+            <w:shd w:fill="EEF4F8"/>
+          </w:tcPr>
+          <w:p>
+            <w:pPr>
+              <w:spacing w:after="40"/>
+            </w:pPr>
+            <w:r/>
+            <w:r>
+              <w:rPr>
+                <w:b w:val="0"/>
+                <w:sz w:val="18"/>
+              </w:rPr>
+              <w:t>Amazon RDS</w:t>
+            </w:r>
+          </w:p>
+        </w:tc>
+        <w:tc>
+          <w:tcPr>
+            <w:tcW w:type="dxa" w:w="3360"/>
+            <w:vAlign w:val="center"/>
+            <w:shd w:fill="EEF4F8"/>
+          </w:tcPr>
+          <w:p>
+            <w:pPr>
+              <w:spacing w:after="40"/>
+            </w:pPr>
+            <w:r/>
+            <w:r>
+              <w:rPr>
+                <w:b w:val="0"/>
+                <w:sz w:val="18"/>
+              </w:rPr>
+              <w:t>Managed MySQL connection from EC2</w:t>
+            </w:r>
+          </w:p>
+        </w:tc>
+      </w:tr>
+      <w:tr>
+        <w:tc>
+          <w:tcPr>
+            <w:tcW w:type="dxa" w:w="3360"/>
+            <w:vAlign w:val="center"/>
+          </w:tcPr>
+          <w:p>
+            <w:pPr>
+              <w:spacing w:after="40"/>
+            </w:pPr>
+            <w:r/>
+            <w:r>
+              <w:rPr>
+                <w:b w:val="0"/>
+                <w:sz w:val="18"/>
+              </w:rPr>
+              <w:t>4.3</w:t>
+            </w:r>
+          </w:p>
+        </w:tc>
+        <w:tc>
+          <w:tcPr>
+            <w:tcW w:type="dxa" w:w="3360"/>
+            <w:vAlign w:val="center"/>
+          </w:tcPr>
+          <w:p>
+            <w:pPr>
+              <w:spacing w:after="40"/>
+            </w:pPr>
+            <w:r/>
+            <w:r>
+              <w:rPr>
+                <w:b w:val="0"/>
+                <w:sz w:val="18"/>
+              </w:rPr>
+              <w:t>Amazon DynamoDB</w:t>
+            </w:r>
+          </w:p>
+        </w:tc>
+        <w:tc>
+          <w:tcPr>
+            <w:tcW w:type="dxa" w:w="3360"/>
+            <w:vAlign w:val="center"/>
+          </w:tcPr>
+          <w:p>
+            <w:pPr>
+              <w:spacing w:after="40"/>
+            </w:pPr>
+            <w:r/>
+            <w:r>
+              <w:rPr>
+                <w:b w:val="0"/>
+                <w:sz w:val="18"/>
+              </w:rPr>
+              <w:t>Table creation, IAM access, item retrieval</w:t>
+            </w:r>
+          </w:p>
+        </w:tc>
+      </w:tr>
+    </w:tbl>
+    <w:p>
+      <w:pPr>
+        <w:spacing w:after="20"/>
+      </w:pPr>
     </w:p>
     <w:p>
       <w:pPr>
         <w:pStyle w:val="Heading1"/>
       </w:pPr>
       <w:r>
-        <w:t>1. AWS Region and Resources</w:t>
-      </w:r>
-    </w:p>
-    <w:p>
-      <w:r>
-        <w:t>All Week 4 resources were created in US East (N. Virginia), us-east-1.</w:t>
+        <w:t>2. Resources Used</w:t>
       </w:r>
     </w:p>
     <w:tbl>
       <w:tblPr>
-        <w:tblStyle w:val="LightShading-Accent1"/>
+        <w:tblStyle w:val="TableGrid"/>
         <w:tblW w:type="auto" w:w="0"/>
         <w:jc w:val="center"/>
         <w:tblLook w:firstColumn="1" w:firstRow="1" w:lastColumn="0" w:lastRow="0" w:noHBand="0" w:noVBand="1" w:val="04A0"/>
       </w:tblPr>
       <w:tblGrid>
-        <w:gridCol w:w="3312"/>
-        <w:gridCol w:w="3312"/>
-        <w:gridCol w:w="3312"/>
+        <w:gridCol w:w="3360"/>
+        <w:gridCol w:w="3360"/>
+        <w:gridCol w:w="3360"/>
       </w:tblGrid>
       <w:tr>
         <w:tc>
           <w:tcPr>
-            <w:tcW w:type="dxa" w:w="3312"/>
+            <w:tcW w:type="dxa" w:w="3360"/>
+            <w:vAlign w:val="center"/>
+            <w:shd w:fill="143F69"/>
           </w:tcPr>
           <w:p>
+            <w:pPr>
+              <w:spacing w:after="40"/>
+            </w:pPr>
+            <w:r/>
             <w:r>
-              <w:t>Service</w:t>
-            </w:r>
-          </w:p>
-        </w:tc>
-        <w:tc>
-          <w:tcPr>
-            <w:tcW w:type="dxa" w:w="3312"/>
-          </w:tcPr>
-          <w:p>
-            <w:r>
+              <w:rPr>
+                <w:b/>
+                <w:color w:val="FFFFFF"/>
+                <w:sz w:val="18"/>
+              </w:rPr>
               <w:t>Resource</w:t>
             </w:r>
           </w:p>
         </w:tc>
         <w:tc>
           <w:tcPr>
-            <w:tcW w:type="dxa" w:w="3312"/>
+            <w:tcW w:type="dxa" w:w="3360"/>
+            <w:vAlign w:val="center"/>
+            <w:shd w:fill="143F69"/>
           </w:tcPr>
           <w:p>
+            <w:pPr>
+              <w:spacing w:after="40"/>
+            </w:pPr>
+            <w:r/>
             <w:r>
+              <w:rPr>
+                <w:b/>
+                <w:color w:val="FFFFFF"/>
+                <w:sz w:val="18"/>
+              </w:rPr>
+              <w:t>Name</w:t>
+            </w:r>
+          </w:p>
+        </w:tc>
+        <w:tc>
+          <w:tcPr>
+            <w:tcW w:type="dxa" w:w="3360"/>
+            <w:vAlign w:val="center"/>
+            <w:shd w:fill="143F69"/>
+          </w:tcPr>
+          <w:p>
+            <w:pPr>
+              <w:spacing w:after="40"/>
+            </w:pPr>
+            <w:r/>
+            <w:r>
+              <w:rPr>
+                <w:b/>
+                <w:color w:val="FFFFFF"/>
+                <w:sz w:val="18"/>
+              </w:rPr>
               <w:t>Purpose</w:t>
             </w:r>
           </w:p>
@@ -100,31 +412,58 @@
       <w:tr>
         <w:tc>
           <w:tcPr>
-            <w:tcW w:type="dxa" w:w="3312"/>
+            <w:tcW w:type="dxa" w:w="3360"/>
+            <w:vAlign w:val="center"/>
           </w:tcPr>
           <w:p>
+            <w:pPr>
+              <w:spacing w:after="40"/>
+            </w:pPr>
+            <w:r/>
             <w:r>
-              <w:t>EC2</w:t>
+              <w:rPr>
+                <w:b w:val="0"/>
+                <w:sz w:val="18"/>
+              </w:rPr>
+              <w:t>RDS MySQL</w:t>
             </w:r>
           </w:p>
         </w:tc>
         <w:tc>
           <w:tcPr>
-            <w:tcW w:type="dxa" w:w="3312"/>
+            <w:tcW w:type="dxa" w:w="3360"/>
+            <w:vAlign w:val="center"/>
           </w:tcPr>
           <w:p>
+            <w:pPr>
+              <w:spacing w:after="40"/>
+            </w:pPr>
+            <w:r/>
             <w:r>
-              <w:t>week4-rds-client</w:t>
+              <w:rPr>
+                <w:b w:val="0"/>
+                <w:sz w:val="18"/>
+              </w:rPr>
+              <w:t>training-db</w:t>
             </w:r>
           </w:p>
         </w:tc>
         <w:tc>
           <w:tcPr>
-            <w:tcW w:type="dxa" w:w="3312"/>
+            <w:tcW w:type="dxa" w:w="3360"/>
+            <w:vAlign w:val="center"/>
           </w:tcPr>
           <w:p>
+            <w:pPr>
+              <w:spacing w:after="40"/>
+            </w:pPr>
+            <w:r/>
             <w:r>
-              <w:t>Temporary client for AWS CLI and RDS connectivity</w:t>
+              <w:rPr>
+                <w:b w:val="0"/>
+                <w:sz w:val="18"/>
+              </w:rPr>
+              <w:t>Relational database practice</w:t>
             </w:r>
           </w:p>
         </w:tc>
@@ -132,31 +471,61 @@
       <w:tr>
         <w:tc>
           <w:tcPr>
-            <w:tcW w:type="dxa" w:w="3312"/>
+            <w:tcW w:type="dxa" w:w="3360"/>
+            <w:vAlign w:val="center"/>
+            <w:shd w:fill="EEF4F8"/>
           </w:tcPr>
           <w:p>
+            <w:pPr>
+              <w:spacing w:after="40"/>
+            </w:pPr>
+            <w:r/>
             <w:r>
-              <w:t>RDS</w:t>
+              <w:rPr>
+                <w:b w:val="0"/>
+                <w:sz w:val="18"/>
+              </w:rPr>
+              <w:t>EC2 client</w:t>
             </w:r>
           </w:p>
         </w:tc>
         <w:tc>
           <w:tcPr>
-            <w:tcW w:type="dxa" w:w="3312"/>
+            <w:tcW w:type="dxa" w:w="3360"/>
+            <w:vAlign w:val="center"/>
+            <w:shd w:fill="EEF4F8"/>
           </w:tcPr>
           <w:p>
+            <w:pPr>
+              <w:spacing w:after="40"/>
+            </w:pPr>
+            <w:r/>
             <w:r>
-              <w:t>training-db</w:t>
+              <w:rPr>
+                <w:b w:val="0"/>
+                <w:sz w:val="18"/>
+              </w:rPr>
+              <w:t>week4-rds-client</w:t>
             </w:r>
           </w:p>
         </w:tc>
         <w:tc>
           <w:tcPr>
-            <w:tcW w:type="dxa" w:w="3312"/>
+            <w:tcW w:type="dxa" w:w="3360"/>
+            <w:vAlign w:val="center"/>
+            <w:shd w:fill="EEF4F8"/>
           </w:tcPr>
           <w:p>
+            <w:pPr>
+              <w:spacing w:after="40"/>
+            </w:pPr>
+            <w:r/>
             <w:r>
-              <w:t>Managed MySQL database instance</w:t>
+              <w:rPr>
+                <w:b w:val="0"/>
+                <w:sz w:val="18"/>
+              </w:rPr>
+              <w:t>Run MySQL client and AWS CLI commands</w:t>
             </w:r>
           </w:p>
         </w:tc>
@@ -164,31 +533,58 @@
       <w:tr>
         <w:tc>
           <w:tcPr>
-            <w:tcW w:type="dxa" w:w="3312"/>
+            <w:tcW w:type="dxa" w:w="3360"/>
+            <w:vAlign w:val="center"/>
           </w:tcPr>
           <w:p>
+            <w:pPr>
+              <w:spacing w:after="40"/>
+            </w:pPr>
+            <w:r/>
             <w:r>
-              <w:t>RDS database</w:t>
+              <w:rPr>
+                <w:b w:val="0"/>
+                <w:sz w:val="18"/>
+              </w:rPr>
+              <w:t>DynamoDB</w:t>
             </w:r>
           </w:p>
         </w:tc>
         <w:tc>
           <w:tcPr>
-            <w:tcW w:type="dxa" w:w="3312"/>
+            <w:tcW w:type="dxa" w:w="3360"/>
+            <w:vAlign w:val="center"/>
           </w:tcPr>
           <w:p>
+            <w:pPr>
+              <w:spacing w:after="40"/>
+            </w:pPr>
+            <w:r/>
             <w:r>
-              <w:t>training_data</w:t>
+              <w:rPr>
+                <w:b w:val="0"/>
+                <w:sz w:val="18"/>
+              </w:rPr>
+              <w:t>Properties</w:t>
             </w:r>
           </w:p>
         </w:tc>
         <w:tc>
           <w:tcPr>
-            <w:tcW w:type="dxa" w:w="3312"/>
+            <w:tcW w:type="dxa" w:w="3360"/>
+            <w:vAlign w:val="center"/>
           </w:tcPr>
           <w:p>
+            <w:pPr>
+              <w:spacing w:after="40"/>
+            </w:pPr>
+            <w:r/>
             <w:r>
-              <w:t>Database created inside the MySQL server</w:t>
+              <w:rPr>
+                <w:b w:val="0"/>
+                <w:sz w:val="18"/>
+              </w:rPr>
+              <w:t>Store/retrieve a sample property item</w:t>
             </w:r>
           </w:p>
         </w:tc>
@@ -196,31 +592,61 @@
       <w:tr>
         <w:tc>
           <w:tcPr>
-            <w:tcW w:type="dxa" w:w="3312"/>
+            <w:tcW w:type="dxa" w:w="3360"/>
+            <w:vAlign w:val="center"/>
+            <w:shd w:fill="EEF4F8"/>
           </w:tcPr>
           <w:p>
+            <w:pPr>
+              <w:spacing w:after="40"/>
+            </w:pPr>
+            <w:r/>
             <w:r>
-              <w:t>DynamoDB</w:t>
+              <w:rPr>
+                <w:b w:val="0"/>
+                <w:sz w:val="18"/>
+              </w:rPr>
+              <w:t>S3 bucket</w:t>
             </w:r>
           </w:p>
         </w:tc>
         <w:tc>
           <w:tcPr>
-            <w:tcW w:type="dxa" w:w="3312"/>
+            <w:tcW w:type="dxa" w:w="3360"/>
+            <w:vAlign w:val="center"/>
+            <w:shd w:fill="EEF4F8"/>
           </w:tcPr>
           <w:p>
+            <w:pPr>
+              <w:spacing w:after="40"/>
+            </w:pPr>
+            <w:r/>
             <w:r>
-              <w:t>Properties</w:t>
+              <w:rPr>
+                <w:b w:val="0"/>
+                <w:sz w:val="18"/>
+              </w:rPr>
+              <w:t>my-training-bucket-kusuma</w:t>
             </w:r>
           </w:p>
         </w:tc>
         <w:tc>
           <w:tcPr>
-            <w:tcW w:type="dxa" w:w="3312"/>
+            <w:tcW w:type="dxa" w:w="3360"/>
+            <w:vAlign w:val="center"/>
+            <w:shd w:fill="EEF4F8"/>
           </w:tcPr>
           <w:p>
+            <w:pPr>
+              <w:spacing w:after="40"/>
+            </w:pPr>
+            <w:r/>
             <w:r>
-              <w:t>NoSQL table with L_ListingID as the partition key</w:t>
+              <w:rPr>
+                <w:b w:val="0"/>
+                <w:sz w:val="18"/>
+              </w:rPr>
+              <w:t>Object upload and lifecycle practice</w:t>
             </w:r>
           </w:p>
         </w:tc>
@@ -228,31 +654,58 @@
       <w:tr>
         <w:tc>
           <w:tcPr>
-            <w:tcW w:type="dxa" w:w="3312"/>
+            <w:tcW w:type="dxa" w:w="3360"/>
+            <w:vAlign w:val="center"/>
           </w:tcPr>
           <w:p>
+            <w:pPr>
+              <w:spacing w:after="40"/>
+            </w:pPr>
+            <w:r/>
             <w:r>
-              <w:t>S3</w:t>
+              <w:rPr>
+                <w:b w:val="0"/>
+                <w:sz w:val="18"/>
+              </w:rPr>
+              <w:t>IAM role</w:t>
             </w:r>
           </w:p>
         </w:tc>
         <w:tc>
           <w:tcPr>
-            <w:tcW w:type="dxa" w:w="3312"/>
+            <w:tcW w:type="dxa" w:w="3360"/>
+            <w:vAlign w:val="center"/>
           </w:tcPr>
           <w:p>
+            <w:pPr>
+              <w:spacing w:after="40"/>
+            </w:pPr>
+            <w:r/>
             <w:r>
-              <w:t>my-training-bucket-kusuma</w:t>
+              <w:rPr>
+                <w:b w:val="0"/>
+                <w:sz w:val="18"/>
+              </w:rPr>
+              <w:t>week4-dynamodb-ec2-role</w:t>
             </w:r>
           </w:p>
         </w:tc>
         <w:tc>
           <w:tcPr>
-            <w:tcW w:type="dxa" w:w="3312"/>
+            <w:tcW w:type="dxa" w:w="3360"/>
+            <w:vAlign w:val="center"/>
           </w:tcPr>
           <w:p>
+            <w:pPr>
+              <w:spacing w:after="40"/>
+            </w:pPr>
+            <w:r/>
             <w:r>
-              <w:t>Temporary object storage and lifecycle lab</w:t>
+              <w:rPr>
+                <w:b w:val="0"/>
+                <w:sz w:val="18"/>
+              </w:rPr>
+              <w:t>Limited DynamoDB access from EC2</w:t>
             </w:r>
           </w:p>
         </w:tc>
@@ -260,45 +713,442 @@
     </w:tbl>
     <w:p>
       <w:pPr>
+        <w:spacing w:after="20"/>
+      </w:pPr>
+    </w:p>
+    <w:p>
+      <w:r>
+        <w:t>These resources were used during the lab. Cleanup was initiated as recorded in Section 7; verify final deletion status in the AWS console.</w:t>
+      </w:r>
+    </w:p>
+    <w:p>
+      <w:pPr>
         <w:pStyle w:val="Heading1"/>
       </w:pPr>
       <w:r>
-        <w:t>2. Create and Connect to the RDS MySQL Database</w:t>
+        <w:t>3. Lab 4.1 — Amazon S3</w:t>
+      </w:r>
+    </w:p>
+    <w:p>
+      <w:pPr>
+        <w:pStyle w:val="Heading2"/>
+      </w:pPr>
+      <w:r>
+        <w:t>Goal</w:t>
       </w:r>
     </w:p>
     <w:p>
       <w:r>
-        <w:t>I used the RDS instance named training-db. The endpoint was training-db.cshy2qcu69ys.us-east-1.rds.amazonaws.com and the MySQL port was 3306. The server reported version 8.4.11.</w:t>
+        <w:t>Practice bucket creation, object upload, lifecycle configuration, and cleanup.</w:t>
+      </w:r>
+    </w:p>
+    <w:p>
+      <w:pPr>
+        <w:pStyle w:val="Heading2"/>
+      </w:pPr>
+      <w:r>
+        <w:t>Steps completed</w:t>
+      </w:r>
+    </w:p>
+    <w:p>
+      <w:pPr>
+        <w:pStyle w:val="ListNumber"/>
+      </w:pPr>
+      <w:r>
+        <w:t>Created my-training-bucket-kusuma in us-east-1.</w:t>
+      </w:r>
+    </w:p>
+    <w:p>
+      <w:pPr>
+        <w:pStyle w:val="ListNumber"/>
+      </w:pPr>
+      <w:r>
+        <w:t>Uploaded an object named runbook.md and verified it using the AWS CLI.</w:t>
+      </w:r>
+    </w:p>
+    <w:p>
+      <w:pPr>
+        <w:pStyle w:val="ListNumber"/>
+      </w:pPr>
+      <w:r>
+        <w:t>Created the archive-after-30-days lifecycle rule to transition eligible objects to S3 Glacier Flexible Retrieval after 30 days.</w:t>
+      </w:r>
+    </w:p>
+    <w:p>
+      <w:pPr>
+        <w:pStyle w:val="ListNumber"/>
+      </w:pPr>
+      <w:r>
+        <w:t>Deleted the test object and bucket during cleanup.</w:t>
+      </w:r>
+    </w:p>
+    <w:p>
+      <w:pPr>
+        <w:pStyle w:val="Heading2"/>
+      </w:pPr>
+      <w:r>
+        <w:t>Verification command</w:t>
+      </w:r>
+    </w:p>
+    <w:p>
+      <w:pPr>
+        <w:spacing w:before="40" w:after="160"/>
+        <w:ind w:left="288"/>
+        <w:shd w:fill="F1F5F8"/>
+      </w:pPr>
+      <w:r>
+        <w:rPr>
+          <w:rFonts w:ascii="Consolas" w:hAnsi="Consolas"/>
+          <w:color w:val="233746"/>
+          <w:sz w:val="17"/>
+        </w:rPr>
+        <w:t>aws s3 ls s3://my-training-bucket-kusuma --region us-east-1</w:t>
       </w:r>
     </w:p>
     <w:p>
       <w:r>
-        <w:t>From the EC2 terminal, I connected with the MySQL client:</w:t>
+        <w:t>Expected result: The command lists current objects. After bucket deletion, it will no longer succeed because the bucket no longer exists.</w:t>
+      </w:r>
+    </w:p>
+    <w:p>
+      <w:r>
+        <w:t>Key takeaway: S3 is object storage. Lifecycle transitions can help manage costs, but Glacier storage classes have minimum storage-duration and retrieval-cost considerations.</w:t>
       </w:r>
     </w:p>
     <w:p>
       <w:pPr>
-        <w:pStyle w:val="NoSpacing"/>
+        <w:pStyle w:val="Heading1"/>
       </w:pPr>
       <w:r>
-        <w:t>mysql -h training-db.cshy2qcu69ys.us-east-1.rds.amazonaws.com -P 3306 -u admin -p</w:t>
+        <w:t>4. Lab 4.2 — Amazon RDS (MySQL)</w:t>
+      </w:r>
+    </w:p>
+    <w:p>
+      <w:pPr>
+        <w:pStyle w:val="Heading2"/>
+      </w:pPr>
+      <w:r>
+        <w:t>Goal</w:t>
       </w:r>
     </w:p>
     <w:p>
       <w:r>
-        <w:t>I entered the password interactively (it is not included in this runbook). The connection succeeded.</w:t>
+        <w:t>Connect to a managed MySQL database from EC2 and practice basic SQL.</w:t>
+      </w:r>
+    </w:p>
+    <w:tbl>
+      <w:tblPr>
+        <w:tblStyle w:val="TableGrid"/>
+        <w:tblW w:type="auto" w:w="0"/>
+        <w:jc w:val="center"/>
+        <w:tblLook w:firstColumn="1" w:firstRow="1" w:lastColumn="0" w:lastRow="0" w:noHBand="0" w:noVBand="1" w:val="04A0"/>
+      </w:tblPr>
+      <w:tblGrid>
+        <w:gridCol w:w="5040"/>
+        <w:gridCol w:w="5040"/>
+      </w:tblGrid>
+      <w:tr>
+        <w:tc>
+          <w:tcPr>
+            <w:tcW w:type="dxa" w:w="5040"/>
+            <w:vAlign w:val="center"/>
+            <w:shd w:fill="143F69"/>
+          </w:tcPr>
+          <w:p>
+            <w:pPr>
+              <w:spacing w:after="40"/>
+            </w:pPr>
+            <w:r/>
+            <w:r>
+              <w:rPr>
+                <w:b/>
+                <w:color w:val="FFFFFF"/>
+                <w:sz w:val="18"/>
+              </w:rPr>
+              <w:t>Setting</w:t>
+            </w:r>
+          </w:p>
+        </w:tc>
+        <w:tc>
+          <w:tcPr>
+            <w:tcW w:type="dxa" w:w="5040"/>
+            <w:vAlign w:val="center"/>
+            <w:shd w:fill="143F69"/>
+          </w:tcPr>
+          <w:p>
+            <w:pPr>
+              <w:spacing w:after="40"/>
+            </w:pPr>
+            <w:r/>
+            <w:r>
+              <w:rPr>
+                <w:b/>
+                <w:color w:val="FFFFFF"/>
+                <w:sz w:val="18"/>
+              </w:rPr>
+              <w:t>Recorded value</w:t>
+            </w:r>
+          </w:p>
+        </w:tc>
+      </w:tr>
+      <w:tr>
+        <w:tc>
+          <w:tcPr>
+            <w:tcW w:type="dxa" w:w="5040"/>
+            <w:vAlign w:val="center"/>
+          </w:tcPr>
+          <w:p>
+            <w:pPr>
+              <w:spacing w:after="40"/>
+            </w:pPr>
+            <w:r/>
+            <w:r>
+              <w:rPr>
+                <w:b w:val="0"/>
+                <w:sz w:val="18"/>
+              </w:rPr>
+              <w:t>DB identifier</w:t>
+            </w:r>
+          </w:p>
+        </w:tc>
+        <w:tc>
+          <w:tcPr>
+            <w:tcW w:type="dxa" w:w="5040"/>
+            <w:vAlign w:val="center"/>
+          </w:tcPr>
+          <w:p>
+            <w:pPr>
+              <w:spacing w:after="40"/>
+            </w:pPr>
+            <w:r/>
+            <w:r>
+              <w:rPr>
+                <w:b w:val="0"/>
+                <w:sz w:val="18"/>
+              </w:rPr>
+              <w:t>training-db</w:t>
+            </w:r>
+          </w:p>
+        </w:tc>
+      </w:tr>
+      <w:tr>
+        <w:tc>
+          <w:tcPr>
+            <w:tcW w:type="dxa" w:w="5040"/>
+            <w:vAlign w:val="center"/>
+            <w:shd w:fill="EEF4F8"/>
+          </w:tcPr>
+          <w:p>
+            <w:pPr>
+              <w:spacing w:after="40"/>
+            </w:pPr>
+            <w:r/>
+            <w:r>
+              <w:rPr>
+                <w:b w:val="0"/>
+                <w:sz w:val="18"/>
+              </w:rPr>
+              <w:t>Engine</w:t>
+            </w:r>
+          </w:p>
+        </w:tc>
+        <w:tc>
+          <w:tcPr>
+            <w:tcW w:type="dxa" w:w="5040"/>
+            <w:vAlign w:val="center"/>
+            <w:shd w:fill="EEF4F8"/>
+          </w:tcPr>
+          <w:p>
+            <w:pPr>
+              <w:spacing w:after="40"/>
+            </w:pPr>
+            <w:r/>
+            <w:r>
+              <w:rPr>
+                <w:b w:val="0"/>
+                <w:sz w:val="18"/>
+              </w:rPr>
+              <w:t>MySQL 8.4</w:t>
+            </w:r>
+          </w:p>
+        </w:tc>
+      </w:tr>
+      <w:tr>
+        <w:tc>
+          <w:tcPr>
+            <w:tcW w:type="dxa" w:w="5040"/>
+            <w:vAlign w:val="center"/>
+          </w:tcPr>
+          <w:p>
+            <w:pPr>
+              <w:spacing w:after="40"/>
+            </w:pPr>
+            <w:r/>
+            <w:r>
+              <w:rPr>
+                <w:b w:val="0"/>
+                <w:sz w:val="18"/>
+              </w:rPr>
+              <w:t>Database</w:t>
+            </w:r>
+          </w:p>
+        </w:tc>
+        <w:tc>
+          <w:tcPr>
+            <w:tcW w:type="dxa" w:w="5040"/>
+            <w:vAlign w:val="center"/>
+          </w:tcPr>
+          <w:p>
+            <w:pPr>
+              <w:spacing w:after="40"/>
+            </w:pPr>
+            <w:r/>
+            <w:r>
+              <w:rPr>
+                <w:b w:val="0"/>
+                <w:sz w:val="18"/>
+              </w:rPr>
+              <w:t>training_data</w:t>
+            </w:r>
+          </w:p>
+        </w:tc>
+      </w:tr>
+      <w:tr>
+        <w:tc>
+          <w:tcPr>
+            <w:tcW w:type="dxa" w:w="5040"/>
+            <w:vAlign w:val="center"/>
+            <w:shd w:fill="EEF4F8"/>
+          </w:tcPr>
+          <w:p>
+            <w:pPr>
+              <w:spacing w:after="40"/>
+            </w:pPr>
+            <w:r/>
+            <w:r>
+              <w:rPr>
+                <w:b w:val="0"/>
+                <w:sz w:val="18"/>
+              </w:rPr>
+              <w:t>Region</w:t>
+            </w:r>
+          </w:p>
+        </w:tc>
+        <w:tc>
+          <w:tcPr>
+            <w:tcW w:type="dxa" w:w="5040"/>
+            <w:vAlign w:val="center"/>
+            <w:shd w:fill="EEF4F8"/>
+          </w:tcPr>
+          <w:p>
+            <w:pPr>
+              <w:spacing w:after="40"/>
+            </w:pPr>
+            <w:r/>
+            <w:r>
+              <w:rPr>
+                <w:b w:val="0"/>
+                <w:sz w:val="18"/>
+              </w:rPr>
+              <w:t>us-east-1</w:t>
+            </w:r>
+          </w:p>
+        </w:tc>
+      </w:tr>
+      <w:tr>
+        <w:tc>
+          <w:tcPr>
+            <w:tcW w:type="dxa" w:w="5040"/>
+            <w:vAlign w:val="center"/>
+          </w:tcPr>
+          <w:p>
+            <w:pPr>
+              <w:spacing w:after="40"/>
+            </w:pPr>
+            <w:r/>
+            <w:r>
+              <w:rPr>
+                <w:b w:val="0"/>
+                <w:sz w:val="18"/>
+              </w:rPr>
+              <w:t>Client</w:t>
+            </w:r>
+          </w:p>
+        </w:tc>
+        <w:tc>
+          <w:tcPr>
+            <w:tcW w:type="dxa" w:w="5040"/>
+            <w:vAlign w:val="center"/>
+          </w:tcPr>
+          <w:p>
+            <w:pPr>
+              <w:spacing w:after="40"/>
+            </w:pPr>
+            <w:r/>
+            <w:r>
+              <w:rPr>
+                <w:b w:val="0"/>
+                <w:sz w:val="18"/>
+              </w:rPr>
+              <w:t>week4-rds-client</w:t>
+            </w:r>
+          </w:p>
+        </w:tc>
+      </w:tr>
+    </w:tbl>
+    <w:p>
+      <w:pPr>
+        <w:spacing w:after="20"/>
+      </w:pPr>
+    </w:p>
+    <w:p>
+      <w:pPr>
+        <w:pStyle w:val="Heading2"/>
+      </w:pPr>
+      <w:r>
+        <w:t>Network access</w:t>
       </w:r>
     </w:p>
     <w:p>
       <w:r>
-        <w:t>I created and selected the training database:</w:t>
+        <w:t>The RDS security group was configured to allow TCP port 3306 from the EC2 client's security group. Keep database access restricted to trusted sources.</w:t>
       </w:r>
     </w:p>
     <w:p>
       <w:pPr>
-        <w:pStyle w:val="NoSpacing"/>
+        <w:pStyle w:val="Heading2"/>
       </w:pPr>
       <w:r>
+        <w:t>Connect to MySQL</w:t>
+      </w:r>
+    </w:p>
+    <w:p>
+      <w:pPr>
+        <w:spacing w:before="40" w:after="160"/>
+        <w:ind w:left="288"/>
+        <w:shd w:fill="F1F5F8"/>
+      </w:pPr>
+      <w:r>
+        <w:rPr>
+          <w:rFonts w:ascii="Consolas" w:hAnsi="Consolas"/>
+          <w:color w:val="233746"/>
+          <w:sz w:val="17"/>
+        </w:rPr>
+        <w:t>mysql -h YOUR_RDS_ENDPOINT -P 3306 -u YOUR_DB_USER -p</w:t>
+      </w:r>
+    </w:p>
+    <w:p>
+      <w:pPr>
+        <w:spacing w:before="40" w:after="160"/>
+        <w:ind w:left="288"/>
+        <w:shd w:fill="F1F5F8"/>
+      </w:pPr>
+      <w:r>
+        <w:rPr>
+          <w:rFonts w:ascii="Consolas" w:hAnsi="Consolas"/>
+          <w:color w:val="233746"/>
+          <w:sz w:val="17"/>
+        </w:rPr>
         <w:t>CREATE DATABASE IF NOT EXISTS training_data;</w:t>
         <w:br/>
         <w:t>USE training_data;</w:t>
@@ -308,7 +1158,30 @@
     </w:p>
     <w:p>
       <w:r>
-        <w:t>The connection worked, but SHOW TABLES returned an empty set. The supplied SQL dump was inspected but was not imported into RDS during the recorded lab work.</w:t>
+        <w:t>Replace placeholders with values from your AWS account. Enter passwords only at the interactive prompt; never place credentials in a repository.</w:t>
+      </w:r>
+    </w:p>
+    <w:p>
+      <w:pPr>
+        <w:pStyle w:val="Heading2"/>
+      </w:pPr>
+      <w:r>
+        <w:t>Import status</w:t>
+      </w:r>
+    </w:p>
+    <w:p>
+      <w:r>
+        <w:t>The supplied property SQL dump required schema adjustments, and the import did not complete reliably during the recorded lab. Do not report the full dataset as successfully imported unless you verify table names, row counts, and sample records.</w:t>
+      </w:r>
+    </w:p>
+    <w:p>
+      <w:r>
+        <w:t>The source dump contained sensitive property and personal information. Do not commit raw dumps or unredacted records to GitHub.</w:t>
+      </w:r>
+    </w:p>
+    <w:p>
+      <w:r>
+        <w:t>Key takeaway: RDS manages database infrastructure; security groups control network connectivity, while database users and grants control database-level access.</w:t>
       </w:r>
     </w:p>
     <w:p>
@@ -316,71 +1189,68 @@
         <w:pStyle w:val="Heading1"/>
       </w:pPr>
       <w:r>
-        <w:t>3. Configure RDS Network Access</w:t>
-      </w:r>
-    </w:p>
-    <w:p>
-      <w:r>
-        <w:t>The RDS security group allowed inbound MySQL/Aurora TCP 3306 from the EC2 client's security group. A separate TCP 3306 rule was also present for a restricted /32 public IP source. I did not open MySQL to 0.0.0.0/0. For future use, remove the temporary IP rule if it is no longer required.</w:t>
+        <w:t>5. Lab 4.3 — Amazon DynamoDB</w:t>
       </w:r>
     </w:p>
     <w:p>
       <w:pPr>
-        <w:pStyle w:val="Heading1"/>
+        <w:pStyle w:val="Heading2"/>
       </w:pPr>
       <w:r>
-        <w:t>4. Create and Test the DynamoDB Table</w:t>
-      </w:r>
-    </w:p>
-    <w:p>
-      <w:r>
-        <w:t>I created a DynamoDB table named Properties with the partition key L_ListingID (String). The table used on-demand read/write capacity.</w:t>
-      </w:r>
-    </w:p>
-    <w:p>
-      <w:r>
-        <w:t>I added a sample item with these attributes:</w:t>
+        <w:t>Configuration</w:t>
       </w:r>
     </w:p>
     <w:tbl>
       <w:tblPr>
-        <w:tblStyle w:val="LightShading-Accent1"/>
+        <w:tblStyle w:val="TableGrid"/>
         <w:tblW w:type="auto" w:w="0"/>
+        <w:jc w:val="center"/>
         <w:tblLook w:firstColumn="1" w:firstRow="1" w:lastColumn="0" w:lastRow="0" w:noHBand="0" w:noVBand="1" w:val="04A0"/>
       </w:tblPr>
       <w:tblGrid>
-        <w:gridCol w:w="3312"/>
-        <w:gridCol w:w="3312"/>
-        <w:gridCol w:w="3312"/>
+        <w:gridCol w:w="5040"/>
+        <w:gridCol w:w="5040"/>
       </w:tblGrid>
       <w:tr>
         <w:tc>
           <w:tcPr>
-            <w:tcW w:type="dxa" w:w="3312"/>
+            <w:tcW w:type="dxa" w:w="5040"/>
+            <w:vAlign w:val="center"/>
+            <w:shd w:fill="143F69"/>
           </w:tcPr>
           <w:p>
+            <w:pPr>
+              <w:spacing w:after="40"/>
+            </w:pPr>
+            <w:r/>
             <w:r>
-              <w:t>Attribute</w:t>
+              <w:rPr>
+                <w:b/>
+                <w:color w:val="FFFFFF"/>
+                <w:sz w:val="18"/>
+              </w:rPr>
+              <w:t>Setting</w:t>
             </w:r>
           </w:p>
         </w:tc>
         <w:tc>
           <w:tcPr>
-            <w:tcW w:type="dxa" w:w="3312"/>
+            <w:tcW w:type="dxa" w:w="5040"/>
+            <w:vAlign w:val="center"/>
+            <w:shd w:fill="143F69"/>
           </w:tcPr>
           <w:p>
+            <w:pPr>
+              <w:spacing w:after="40"/>
+            </w:pPr>
+            <w:r/>
             <w:r>
+              <w:rPr>
+                <w:b/>
+                <w:color w:val="FFFFFF"/>
+                <w:sz w:val="18"/>
+              </w:rPr>
               <w:t>Value</w:t>
-            </w:r>
-          </w:p>
-        </w:tc>
-        <w:tc>
-          <w:tcPr>
-            <w:tcW w:type="dxa" w:w="3312"/>
-          </w:tcPr>
-          <w:p>
-            <w:r>
-              <w:t>Type</w:t>
             </w:r>
           </w:p>
         </w:tc>
@@ -388,31 +1258,39 @@
       <w:tr>
         <w:tc>
           <w:tcPr>
-            <w:tcW w:type="dxa" w:w="3312"/>
+            <w:tcW w:type="dxa" w:w="5040"/>
+            <w:vAlign w:val="center"/>
           </w:tcPr>
           <w:p>
+            <w:pPr>
+              <w:spacing w:after="40"/>
+            </w:pPr>
+            <w:r/>
             <w:r>
-              <w:t>L_ListingID</w:t>
+              <w:rPr>
+                <w:b w:val="0"/>
+                <w:sz w:val="18"/>
+              </w:rPr>
+              <w:t>Table</w:t>
             </w:r>
           </w:p>
         </w:tc>
         <w:tc>
           <w:tcPr>
-            <w:tcW w:type="dxa" w:w="3312"/>
+            <w:tcW w:type="dxa" w:w="5040"/>
+            <w:vAlign w:val="center"/>
           </w:tcPr>
           <w:p>
+            <w:pPr>
+              <w:spacing w:after="40"/>
+            </w:pPr>
+            <w:r/>
             <w:r>
-              <w:t>R100001</w:t>
-            </w:r>
-          </w:p>
-        </w:tc>
-        <w:tc>
-          <w:tcPr>
-            <w:tcW w:type="dxa" w:w="3312"/>
-          </w:tcPr>
-          <w:p>
-            <w:r>
-              <w:t>String (partition key)</w:t>
+              <w:rPr>
+                <w:b w:val="0"/>
+                <w:sz w:val="18"/>
+              </w:rPr>
+              <w:t>Properties</w:t>
             </w:r>
           </w:p>
         </w:tc>
@@ -420,30 +1298,80 @@
       <w:tr>
         <w:tc>
           <w:tcPr>
-            <w:tcW w:type="dxa" w:w="3312"/>
+            <w:tcW w:type="dxa" w:w="5040"/>
+            <w:vAlign w:val="center"/>
+            <w:shd w:fill="EEF4F8"/>
           </w:tcPr>
           <w:p>
+            <w:pPr>
+              <w:spacing w:after="40"/>
+            </w:pPr>
+            <w:r/>
             <w:r>
-              <w:t>L_City</w:t>
+              <w:rPr>
+                <w:b w:val="0"/>
+                <w:sz w:val="18"/>
+              </w:rPr>
+              <w:t>Partition key</w:t>
             </w:r>
           </w:p>
         </w:tc>
         <w:tc>
           <w:tcPr>
-            <w:tcW w:type="dxa" w:w="3312"/>
+            <w:tcW w:type="dxa" w:w="5040"/>
+            <w:vAlign w:val="center"/>
+            <w:shd w:fill="EEF4F8"/>
           </w:tcPr>
           <w:p>
+            <w:pPr>
+              <w:spacing w:after="40"/>
+            </w:pPr>
+            <w:r/>
             <w:r>
-              <w:t>Los Angeles</w:t>
+              <w:rPr>
+                <w:b w:val="0"/>
+                <w:sz w:val="18"/>
+              </w:rPr>
+              <w:t>L_ListingID</w:t>
+            </w:r>
+          </w:p>
+        </w:tc>
+      </w:tr>
+      <w:tr>
+        <w:tc>
+          <w:tcPr>
+            <w:tcW w:type="dxa" w:w="5040"/>
+            <w:vAlign w:val="center"/>
+          </w:tcPr>
+          <w:p>
+            <w:pPr>
+              <w:spacing w:after="40"/>
+            </w:pPr>
+            <w:r/>
+            <w:r>
+              <w:rPr>
+                <w:b w:val="0"/>
+                <w:sz w:val="18"/>
+              </w:rPr>
+              <w:t>Key type</w:t>
             </w:r>
           </w:p>
         </w:tc>
         <w:tc>
           <w:tcPr>
-            <w:tcW w:type="dxa" w:w="3312"/>
+            <w:tcW w:type="dxa" w:w="5040"/>
+            <w:vAlign w:val="center"/>
           </w:tcPr>
           <w:p>
+            <w:pPr>
+              <w:spacing w:after="40"/>
+            </w:pPr>
+            <w:r/>
             <w:r>
+              <w:rPr>
+                <w:b w:val="0"/>
+                <w:sz w:val="18"/>
+              </w:rPr>
               <w:t>String</w:t>
             </w:r>
           </w:p>
@@ -452,31 +1380,41 @@
       <w:tr>
         <w:tc>
           <w:tcPr>
-            <w:tcW w:type="dxa" w:w="3312"/>
+            <w:tcW w:type="dxa" w:w="5040"/>
+            <w:vAlign w:val="center"/>
+            <w:shd w:fill="EEF4F8"/>
           </w:tcPr>
           <w:p>
+            <w:pPr>
+              <w:spacing w:after="40"/>
+            </w:pPr>
+            <w:r/>
             <w:r>
-              <w:t>L_State</w:t>
+              <w:rPr>
+                <w:b w:val="0"/>
+                <w:sz w:val="18"/>
+              </w:rPr>
+              <w:t>Capacity mode</w:t>
             </w:r>
           </w:p>
         </w:tc>
         <w:tc>
           <w:tcPr>
-            <w:tcW w:type="dxa" w:w="3312"/>
+            <w:tcW w:type="dxa" w:w="5040"/>
+            <w:vAlign w:val="center"/>
+            <w:shd w:fill="EEF4F8"/>
           </w:tcPr>
           <w:p>
+            <w:pPr>
+              <w:spacing w:after="40"/>
+            </w:pPr>
+            <w:r/>
             <w:r>
-              <w:t>CA</w:t>
-            </w:r>
-          </w:p>
-        </w:tc>
-        <w:tc>
-          <w:tcPr>
-            <w:tcW w:type="dxa" w:w="3312"/>
-          </w:tcPr>
-          <w:p>
-            <w:r>
-              <w:t>String</w:t>
+              <w:rPr>
+                <w:b w:val="0"/>
+                <w:sz w:val="18"/>
+              </w:rPr>
+              <w:t>On-demand</w:t>
             </w:r>
           </w:p>
         </w:tc>
@@ -484,31 +1422,184 @@
       <w:tr>
         <w:tc>
           <w:tcPr>
-            <w:tcW w:type="dxa" w:w="3312"/>
+            <w:tcW w:type="dxa" w:w="5040"/>
+            <w:vAlign w:val="center"/>
           </w:tcPr>
           <w:p>
+            <w:pPr>
+              <w:spacing w:after="40"/>
+            </w:pPr>
+            <w:r/>
             <w:r>
-              <w:t>L_SystemPrice</w:t>
+              <w:rPr>
+                <w:b w:val="0"/>
+                <w:sz w:val="18"/>
+              </w:rPr>
+              <w:t>Region</w:t>
             </w:r>
           </w:p>
         </w:tc>
         <w:tc>
           <w:tcPr>
-            <w:tcW w:type="dxa" w:w="3312"/>
+            <w:tcW w:type="dxa" w:w="5040"/>
+            <w:vAlign w:val="center"/>
           </w:tcPr>
           <w:p>
+            <w:pPr>
+              <w:spacing w:after="40"/>
+            </w:pPr>
+            <w:r/>
             <w:r>
-              <w:t>2639425</w:t>
+              <w:rPr>
+                <w:b w:val="0"/>
+                <w:sz w:val="18"/>
+              </w:rPr>
+              <w:t>us-east-1</w:t>
+            </w:r>
+          </w:p>
+        </w:tc>
+      </w:tr>
+    </w:tbl>
+    <w:p>
+      <w:pPr>
+        <w:spacing w:after="20"/>
+      </w:pPr>
+    </w:p>
+    <w:p>
+      <w:pPr>
+        <w:pStyle w:val="Heading2"/>
+      </w:pPr>
+      <w:r>
+        <w:t>Steps completed</w:t>
+      </w:r>
+    </w:p>
+    <w:p>
+      <w:pPr>
+        <w:pStyle w:val="ListNumber"/>
+      </w:pPr>
+      <w:r>
+        <w:t>Created the Properties table and added a sample item for testing.</w:t>
+      </w:r>
+    </w:p>
+    <w:p>
+      <w:pPr>
+        <w:pStyle w:val="ListNumber"/>
+      </w:pPr>
+      <w:r>
+        <w:t>Attached an IAM role to EC2 with limited DynamoDB permissions.</w:t>
+      </w:r>
+    </w:p>
+    <w:p>
+      <w:pPr>
+        <w:pStyle w:val="ListNumber"/>
+      </w:pPr>
+      <w:r>
+        <w:t>Checked the AWS identity and tested item retrieval.</w:t>
+      </w:r>
+    </w:p>
+    <w:p>
+      <w:pPr>
+        <w:pStyle w:val="Heading2"/>
+      </w:pPr>
+      <w:r>
+        <w:t>Retrieve an item</w:t>
+      </w:r>
+    </w:p>
+    <w:p>
+      <w:pPr>
+        <w:spacing w:before="40" w:after="160"/>
+        <w:ind w:left="288"/>
+        <w:shd w:fill="F1F5F8"/>
+      </w:pPr>
+      <w:r>
+        <w:rPr>
+          <w:rFonts w:ascii="Consolas" w:hAnsi="Consolas"/>
+          <w:color w:val="233746"/>
+          <w:sz w:val="17"/>
+        </w:rPr>
+        <w:t>aws dynamodb get-item \</w:t>
+        <w:br/>
+        <w:t xml:space="preserve">  --table-name Properties \</w:t>
+        <w:br/>
+        <w:t xml:space="preserve">  --key '{"L_ListingID":{"S":"R100001"}}' \</w:t>
+        <w:br/>
+        <w:t xml:space="preserve">  --region us-east-1</w:t>
+      </w:r>
+    </w:p>
+    <w:p>
+      <w:r>
+        <w:t>Expected result: If the table and item exist, the command returns item attributes as JSON. If the item is absent, the response may contain no Item.</w:t>
+      </w:r>
+    </w:p>
+    <w:p>
+      <w:r>
+        <w:t>The EC2 role was configured for table-scoped actions such as GetItem, PutItem, and DescribeTable.</w:t>
+      </w:r>
+    </w:p>
+    <w:p>
+      <w:r>
+        <w:t>Key takeaway: DynamoDB is a managed NoSQL database. The partition key identifies items, and IAM policies control AWS API access.</w:t>
+      </w:r>
+    </w:p>
+    <w:p>
+      <w:pPr>
+        <w:pStyle w:val="Heading1"/>
+      </w:pPr>
+      <w:r>
+        <w:t>6. Troubleshooting &amp; Lessons Learned</w:t>
+      </w:r>
+    </w:p>
+    <w:tbl>
+      <w:tblPr>
+        <w:tblStyle w:val="TableGrid"/>
+        <w:tblW w:type="auto" w:w="0"/>
+        <w:jc w:val="center"/>
+        <w:tblLook w:firstColumn="1" w:firstRow="1" w:lastColumn="0" w:lastRow="0" w:noHBand="0" w:noVBand="1" w:val="04A0"/>
+      </w:tblPr>
+      <w:tblGrid>
+        <w:gridCol w:w="5040"/>
+        <w:gridCol w:w="5040"/>
+      </w:tblGrid>
+      <w:tr>
+        <w:tc>
+          <w:tcPr>
+            <w:tcW w:type="dxa" w:w="5040"/>
+            <w:vAlign w:val="center"/>
+            <w:shd w:fill="143F69"/>
+          </w:tcPr>
+          <w:p>
+            <w:pPr>
+              <w:spacing w:after="40"/>
+            </w:pPr>
+            <w:r/>
+            <w:r>
+              <w:rPr>
+                <w:b/>
+                <w:color w:val="FFFFFF"/>
+                <w:sz w:val="18"/>
+              </w:rPr>
+              <w:t>Issue</w:t>
             </w:r>
           </w:p>
         </w:tc>
         <w:tc>
           <w:tcPr>
-            <w:tcW w:type="dxa" w:w="3312"/>
+            <w:tcW w:type="dxa" w:w="5040"/>
+            <w:vAlign w:val="center"/>
+            <w:shd w:fill="143F69"/>
           </w:tcPr>
           <w:p>
+            <w:pPr>
+              <w:spacing w:after="40"/>
+            </w:pPr>
+            <w:r/>
             <w:r>
-              <w:t>Number</w:t>
+              <w:rPr>
+                <w:b/>
+                <w:color w:val="FFFFFF"/>
+                <w:sz w:val="18"/>
+              </w:rPr>
+              <w:t>Resolution / lesson</w:t>
             </w:r>
           </w:p>
         </w:tc>
@@ -516,52 +1607,237 @@
       <w:tr>
         <w:tc>
           <w:tcPr>
-            <w:tcW w:type="dxa" w:w="3312"/>
+            <w:tcW w:type="dxa" w:w="5040"/>
+            <w:vAlign w:val="center"/>
           </w:tcPr>
           <w:p>
+            <w:pPr>
+              <w:spacing w:after="40"/>
+            </w:pPr>
+            <w:r/>
             <w:r>
-              <w:t>L_Class</w:t>
+              <w:rPr>
+                <w:b w:val="0"/>
+                <w:sz w:val="18"/>
+              </w:rPr>
+              <w:t>Network utility unavailable</w:t>
             </w:r>
           </w:p>
         </w:tc>
         <w:tc>
           <w:tcPr>
-            <w:tcW w:type="dxa" w:w="3312"/>
+            <w:tcW w:type="dxa" w:w="5040"/>
+            <w:vAlign w:val="center"/>
           </w:tcPr>
           <w:p>
+            <w:pPr>
+              <w:spacing w:after="40"/>
+            </w:pPr>
+            <w:r/>
             <w:r>
-              <w:t>Residential</w:t>
+              <w:rPr>
+                <w:b w:val="0"/>
+                <w:sz w:val="18"/>
+              </w:rPr>
+              <w:t>Not every utility is preinstalled on Amazon Linux; check available tools and use an appropriate alternative.</w:t>
+            </w:r>
+          </w:p>
+        </w:tc>
+      </w:tr>
+      <w:tr>
+        <w:tc>
+          <w:tcPr>
+            <w:tcW w:type="dxa" w:w="5040"/>
+            <w:vAlign w:val="center"/>
+            <w:shd w:fill="EEF4F8"/>
+          </w:tcPr>
+          <w:p>
+            <w:pPr>
+              <w:spacing w:after="40"/>
+            </w:pPr>
+            <w:r/>
+            <w:r>
+              <w:rPr>
+                <w:b w:val="0"/>
+                <w:sz w:val="18"/>
+              </w:rPr>
+              <w:t>DynamoDB access denied</w:t>
             </w:r>
           </w:p>
         </w:tc>
         <w:tc>
           <w:tcPr>
-            <w:tcW w:type="dxa" w:w="3312"/>
+            <w:tcW w:type="dxa" w:w="5040"/>
+            <w:vAlign w:val="center"/>
+            <w:shd w:fill="EEF4F8"/>
           </w:tcPr>
           <w:p>
+            <w:pPr>
+              <w:spacing w:after="40"/>
+            </w:pPr>
+            <w:r/>
             <w:r>
-              <w:t>String</w:t>
+              <w:rPr>
+                <w:b w:val="0"/>
+                <w:sz w:val="18"/>
+              </w:rPr>
+              <w:t>Attach an EC2 IAM role with required permissions; avoid long-term access keys on the instance.</w:t>
+            </w:r>
+          </w:p>
+        </w:tc>
+      </w:tr>
+      <w:tr>
+        <w:tc>
+          <w:tcPr>
+            <w:tcW w:type="dxa" w:w="5040"/>
+            <w:vAlign w:val="center"/>
+          </w:tcPr>
+          <w:p>
+            <w:pPr>
+              <w:spacing w:after="40"/>
+            </w:pPr>
+            <w:r/>
+            <w:r>
+              <w:rPr>
+                <w:b w:val="0"/>
+                <w:sz w:val="18"/>
+              </w:rPr>
+              <w:t>SQL import interrupted</w:t>
+            </w:r>
+          </w:p>
+        </w:tc>
+        <w:tc>
+          <w:tcPr>
+            <w:tcW w:type="dxa" w:w="5040"/>
+            <w:vAlign w:val="center"/>
+          </w:tcPr>
+          <w:p>
+            <w:pPr>
+              <w:spacing w:after="40"/>
+            </w:pPr>
+            <w:r/>
+            <w:r>
+              <w:rPr>
+                <w:b w:val="0"/>
+                <w:sz w:val="18"/>
+              </w:rPr>
+              <w:t>Verify table names, row counts, and sample records before calling an import successful.</w:t>
+            </w:r>
+          </w:p>
+        </w:tc>
+      </w:tr>
+      <w:tr>
+        <w:tc>
+          <w:tcPr>
+            <w:tcW w:type="dxa" w:w="5040"/>
+            <w:vAlign w:val="center"/>
+            <w:shd w:fill="EEF4F8"/>
+          </w:tcPr>
+          <w:p>
+            <w:pPr>
+              <w:spacing w:after="40"/>
+            </w:pPr>
+            <w:r/>
+            <w:r>
+              <w:rPr>
+                <w:b w:val="0"/>
+                <w:sz w:val="18"/>
+              </w:rPr>
+              <w:t>S3 cleanup order</w:t>
+            </w:r>
+          </w:p>
+        </w:tc>
+        <w:tc>
+          <w:tcPr>
+            <w:tcW w:type="dxa" w:w="5040"/>
+            <w:vAlign w:val="center"/>
+            <w:shd w:fill="EEF4F8"/>
+          </w:tcPr>
+          <w:p>
+            <w:pPr>
+              <w:spacing w:after="40"/>
+            </w:pPr>
+            <w:r/>
+            <w:r>
+              <w:rPr>
+                <w:b w:val="0"/>
+                <w:sz w:val="18"/>
+              </w:rPr>
+              <w:t>Remove objects and review lifecycle configuration before deleting a bucket.</w:t>
             </w:r>
           </w:p>
         </w:tc>
       </w:tr>
     </w:tbl>
     <w:p>
+      <w:pPr>
+        <w:spacing w:after="20"/>
+      </w:pPr>
+    </w:p>
+    <w:p>
+      <w:pPr>
+        <w:pStyle w:val="Heading1"/>
+      </w:pPr>
       <w:r>
-        <w:t>I verified the item using the AWS CLI:</w:t>
+        <w:t>7. Cleanup Checklist</w:t>
+      </w:r>
+    </w:p>
+    <w:p>
+      <w:r>
+        <w:t>Cleanup actions were reported as performed or initiated. Confirm the final state in the AWS console before considering cleanup complete.</w:t>
       </w:r>
     </w:p>
     <w:p>
       <w:pPr>
-        <w:pStyle w:val="NoSpacing"/>
+        <w:pStyle w:val="ListBullet"/>
       </w:pPr>
       <w:r>
-        <w:t>aws dynamodb get-item --table-name Properties --key '{"L_ListingID":{"S":"R100001"}}' --region us-east-1</w:t>
+        <w:t>S3: test object and bucket deleted; deletion was shown in the console.</w:t>
+      </w:r>
+    </w:p>
+    <w:p>
+      <w:pPr>
+        <w:pStyle w:val="ListBullet"/>
+      </w:pPr>
+      <w:r>
+        <w:t>DynamoDB: confirm Properties is fully deleted, not still in Deleting state.</w:t>
+      </w:r>
+    </w:p>
+    <w:p>
+      <w:pPr>
+        <w:pStyle w:val="ListBullet"/>
+      </w:pPr>
+      <w:r>
+        <w:t>RDS: confirm training-db is fully deleted.</w:t>
+      </w:r>
+    </w:p>
+    <w:p>
+      <w:pPr>
+        <w:pStyle w:val="ListBullet"/>
+      </w:pPr>
+      <w:r>
+        <w:t>EC2: confirm week4-rds-client is terminated.</w:t>
+      </w:r>
+    </w:p>
+    <w:p>
+      <w:pPr>
+        <w:pStyle w:val="ListBullet"/>
+      </w:pPr>
+      <w:r>
+        <w:t>IAM: review week4-dynamodb-ec2-role and remove it only if no longer needed.</w:t>
+      </w:r>
+    </w:p>
+    <w:p>
+      <w:pPr>
+        <w:pStyle w:val="ListBullet"/>
+      </w:pPr>
+      <w:r>
+        <w:t>Billing: check for leftover EBS volumes, snapshots, RDS snapshots, Elastic IP addresses, and NAT gateways.</w:t>
       </w:r>
     </w:p>
     <w:p>
       <w:r>
-        <w:t>The command returned the item with the expected listing ID, city, state, price, and property class.</w:t>
+        <w:t>Do not delete the default VPC, subnets, or route tables as part of this lab cleanup.</w:t>
       </w:r>
     </w:p>
     <w:p>
@@ -569,66 +1845,7 @@
         <w:pStyle w:val="Heading1"/>
       </w:pPr>
       <w:r>
-        <w:t>5. Create and Test the S3 Bucket</w:t>
-      </w:r>
-    </w:p>
-    <w:p>
-      <w:r>
-        <w:t>I created the S3 bucket in us-east-1:</w:t>
-      </w:r>
-    </w:p>
-    <w:p>
-      <w:pPr>
-        <w:pStyle w:val="NoSpacing"/>
-      </w:pPr>
-      <w:r>
-        <w:t>aws s3 mb s3://my-training-bucket-kusuma --region us-east-1</w:t>
-      </w:r>
-    </w:p>
-    <w:p>
-      <w:r>
-        <w:t>I uploaded the Week 3 runbook and verified that it appeared in the bucket:</w:t>
-      </w:r>
-    </w:p>
-    <w:p>
-      <w:pPr>
-        <w:pStyle w:val="NoSpacing"/>
-      </w:pPr>
-      <w:r>
-        <w:t>aws s3 cp week-03/runbook.md s3://my-training-bucket-kusuma/</w:t>
-        <w:br/>
-        <w:t>aws s3 ls s3://my-training-bucket-kusuma/</w:t>
-      </w:r>
-    </w:p>
-    <w:p>
-      <w:r>
-        <w:t>The `aws s3 ls` output showed runbook.md. The object was used for the storage and lifecycle exercise.</w:t>
-      </w:r>
-    </w:p>
-    <w:p>
-      <w:pPr>
-        <w:pStyle w:val="Heading1"/>
-      </w:pPr>
-      <w:r>
-        <w:t>6. Configure the S3 Lifecycle Rule</w:t>
-      </w:r>
-    </w:p>
-    <w:p>
-      <w:r>
-        <w:t>I created and enabled a lifecycle rule named archive-after-30-days for the bucket. The rule was configured to transition eligible objects to Glacier Flexible Retrieval after 30 days.</w:t>
-      </w:r>
-    </w:p>
-    <w:p>
-      <w:r>
-        <w:t>Glacier storage classes can have minimum storage-duration charges. To avoid leaving the object to transition and potentially incur early-deletion charges, I deleted runbook.md while it was still in Standard storage, then deleted the now-empty S3 bucket. Deleting the bucket also removed its lifecycle configuration.</w:t>
-      </w:r>
-    </w:p>
-    <w:p>
-      <w:pPr>
-        <w:pStyle w:val="Heading1"/>
-      </w:pPr>
-      <w:r>
-        <w:t>7. Issues and Troubleshooting</w:t>
+        <w:t>8. Evidence &amp; Deliverables</w:t>
       </w:r>
     </w:p>
     <w:p>
@@ -636,13 +1853,7 @@
         <w:pStyle w:val="ListBullet"/>
       </w:pPr>
       <w:r>
-        <w:rPr>
-          <w:b/>
-        </w:rPr>
-        <w:t xml:space="preserve">`nc: command not found` — </w:t>
-      </w:r>
-      <w:r>
-        <w:t>The netcat utility was not installed on the EC2 client. I used the MySQL client connection to validate RDS connectivity instead.</w:t>
+        <w:t>DynamoDB table creation and sample item</w:t>
       </w:r>
     </w:p>
     <w:p>
@@ -650,13 +1861,7 @@
         <w:pStyle w:val="ListBullet"/>
       </w:pPr>
       <w:r>
-        <w:rPr>
-          <w:b/>
-        </w:rPr>
-        <w:t xml:space="preserve">DynamoDB table showed 0 bytes — </w:t>
-      </w:r>
-      <w:r>
-        <w:t>The table had been created but had no items yet. I added a test item and verified it using get-item.</w:t>
+        <w:t>Successful DynamoDB get-item command</w:t>
       </w:r>
     </w:p>
     <w:p>
@@ -664,13 +1869,7 @@
         <w:pStyle w:val="ListBullet"/>
       </w:pPr>
       <w:r>
-        <w:rPr>
-          <w:b/>
-        </w:rPr>
-        <w:t xml:space="preserve">S3 bucket deletion was blocked — </w:t>
-      </w:r>
-      <w:r>
-        <w:t>S3 buckets must be empty before deletion. I deleted runbook.md first and then deleted the bucket.</w:t>
+        <w:t>EC2 instance and IAM role configuration</w:t>
       </w:r>
     </w:p>
     <w:p>
@@ -678,26 +1877,7 @@
         <w:pStyle w:val="ListBullet"/>
       </w:pPr>
       <w:r>
-        <w:rPr>
-          <w:b/>
-        </w:rPr>
-        <w:t xml:space="preserve">RDS deletion took time — </w:t>
-      </w:r>
-      <w:r>
-        <w:t>RDS deletion may take several minutes. I refreshed the Databases page to check its status.</w:t>
-      </w:r>
-    </w:p>
-    <w:p>
-      <w:pPr>
-        <w:pStyle w:val="Heading1"/>
-      </w:pPr>
-      <w:r>
-        <w:t>8. Cleanup</w:t>
-      </w:r>
-    </w:p>
-    <w:p>
-      <w:r>
-        <w:t>The Week 4 handbook cleanup called for deleting the DynamoDB table, RDS instance, and S3 object/lifecycle resources. The recorded cleanup actions were:</w:t>
+        <w:t>S3 object upload and lifecycle rule</w:t>
       </w:r>
     </w:p>
     <w:p>
@@ -705,7 +1885,7 @@
         <w:pStyle w:val="ListBullet"/>
       </w:pPr>
       <w:r>
-        <w:t>DynamoDB Properties table — deletion request submitted; verify the table no longer appears before marking cleanup fully verified.</w:t>
+        <w:t>S3 bucket deletion</w:t>
       </w:r>
     </w:p>
     <w:p>
@@ -713,211 +1893,237 @@
         <w:pStyle w:val="ListBullet"/>
       </w:pPr>
       <w:r>
-        <w:t>EC2 week4-rds-client — termination was reported as completed; verify the instance state is Terminated.</w:t>
-      </w:r>
-    </w:p>
-    <w:p>
-      <w:pPr>
-        <w:pStyle w:val="ListBullet"/>
-      </w:pPr>
-      <w:r>
-        <w:t>RDS training-db — deletion was initiated; verify it no longer appears in the RDS Databases list.</w:t>
-      </w:r>
-    </w:p>
-    <w:p>
-      <w:pPr>
-        <w:pStyle w:val="ListBullet"/>
-      </w:pPr>
-      <w:r>
-        <w:t>S3 my-training-bucket-kusuma — bucket deletion succeeded; the bucket list showed no buckets.</w:t>
+        <w:t>RDS connection and security-group configuration, if available</w:t>
       </w:r>
     </w:p>
     <w:p>
       <w:r>
-        <w:t>Final cost check: inspect EC2 → Volumes and Snapshots, EC2 → Elastic IPs, VPC → NAT gateways, RDS → Snapshots, and Billing/Cost Explorer for remaining billable resources. Leave the default VPC, subnets, and route tables in place unless you have confirmed they are lab-only and unused.</w:t>
+        <w:t>Before committing screenshots, confirm they do not expose passwords, access keys, sensitive records, or unnecessary personal information.</w:t>
       </w:r>
+    </w:p>
+    <w:tbl>
+      <w:tblPr>
+        <w:tblStyle w:val="TableGrid"/>
+        <w:tblW w:type="auto" w:w="0"/>
+        <w:jc w:val="center"/>
+        <w:tblLook w:firstColumn="1" w:firstRow="1" w:lastColumn="0" w:lastRow="0" w:noHBand="0" w:noVBand="1" w:val="04A0"/>
+      </w:tblPr>
+      <w:tblGrid>
+        <w:gridCol w:w="5040"/>
+        <w:gridCol w:w="5040"/>
+      </w:tblGrid>
+      <w:tr>
+        <w:tc>
+          <w:tcPr>
+            <w:tcW w:type="dxa" w:w="5040"/>
+            <w:vAlign w:val="center"/>
+            <w:shd w:fill="143F69"/>
+          </w:tcPr>
+          <w:p>
+            <w:pPr>
+              <w:spacing w:after="40"/>
+            </w:pPr>
+            <w:r/>
+            <w:r>
+              <w:rPr>
+                <w:b/>
+                <w:color w:val="FFFFFF"/>
+                <w:sz w:val="18"/>
+              </w:rPr>
+              <w:t>Deliverable</w:t>
+            </w:r>
+          </w:p>
+        </w:tc>
+        <w:tc>
+          <w:tcPr>
+            <w:tcW w:type="dxa" w:w="5040"/>
+            <w:vAlign w:val="center"/>
+            <w:shd w:fill="143F69"/>
+          </w:tcPr>
+          <w:p>
+            <w:pPr>
+              <w:spacing w:after="40"/>
+            </w:pPr>
+            <w:r/>
+            <w:r>
+              <w:rPr>
+                <w:b/>
+                <w:color w:val="FFFFFF"/>
+                <w:sz w:val="18"/>
+              </w:rPr>
+              <w:t>Location</w:t>
+            </w:r>
+          </w:p>
+        </w:tc>
+      </w:tr>
+      <w:tr>
+        <w:tc>
+          <w:tcPr>
+            <w:tcW w:type="dxa" w:w="5040"/>
+            <w:vAlign w:val="center"/>
+          </w:tcPr>
+          <w:p>
+            <w:pPr>
+              <w:spacing w:after="40"/>
+            </w:pPr>
+            <w:r/>
+            <w:r>
+              <w:rPr>
+                <w:b w:val="0"/>
+                <w:sz w:val="18"/>
+              </w:rPr>
+              <w:t>Storage decision guide</w:t>
+            </w:r>
+          </w:p>
+        </w:tc>
+        <w:tc>
+          <w:tcPr>
+            <w:tcW w:type="dxa" w:w="5040"/>
+            <w:vAlign w:val="center"/>
+          </w:tcPr>
+          <w:p>
+            <w:pPr>
+              <w:spacing w:after="40"/>
+            </w:pPr>
+            <w:r/>
+            <w:r>
+              <w:rPr>
+                <w:b w:val="0"/>
+                <w:sz w:val="18"/>
+              </w:rPr>
+              <w:t>week-04/decision-guide.md</w:t>
+            </w:r>
+          </w:p>
+        </w:tc>
+      </w:tr>
+      <w:tr>
+        <w:tc>
+          <w:tcPr>
+            <w:tcW w:type="dxa" w:w="5040"/>
+            <w:vAlign w:val="center"/>
+            <w:shd w:fill="EEF4F8"/>
+          </w:tcPr>
+          <w:p>
+            <w:pPr>
+              <w:spacing w:after="40"/>
+            </w:pPr>
+            <w:r/>
+            <w:r>
+              <w:rPr>
+                <w:b w:val="0"/>
+                <w:sz w:val="18"/>
+              </w:rPr>
+              <w:t>Week 4 runbook</w:t>
+            </w:r>
+          </w:p>
+        </w:tc>
+        <w:tc>
+          <w:tcPr>
+            <w:tcW w:type="dxa" w:w="5040"/>
+            <w:vAlign w:val="center"/>
+            <w:shd w:fill="EEF4F8"/>
+          </w:tcPr>
+          <w:p>
+            <w:pPr>
+              <w:spacing w:after="40"/>
+            </w:pPr>
+            <w:r/>
+            <w:r>
+              <w:rPr>
+                <w:b w:val="0"/>
+                <w:sz w:val="18"/>
+              </w:rPr>
+              <w:t>week-04/runbook.md</w:t>
+            </w:r>
+          </w:p>
+        </w:tc>
+      </w:tr>
+      <w:tr>
+        <w:tc>
+          <w:tcPr>
+            <w:tcW w:type="dxa" w:w="5040"/>
+            <w:vAlign w:val="center"/>
+          </w:tcPr>
+          <w:p>
+            <w:pPr>
+              <w:spacing w:after="40"/>
+            </w:pPr>
+            <w:r/>
+            <w:r>
+              <w:rPr>
+                <w:b w:val="0"/>
+                <w:sz w:val="18"/>
+              </w:rPr>
+              <w:t>Word copy</w:t>
+            </w:r>
+          </w:p>
+        </w:tc>
+        <w:tc>
+          <w:tcPr>
+            <w:tcW w:type="dxa" w:w="5040"/>
+            <w:vAlign w:val="center"/>
+          </w:tcPr>
+          <w:p>
+            <w:pPr>
+              <w:spacing w:after="40"/>
+            </w:pPr>
+            <w:r/>
+            <w:r>
+              <w:rPr>
+                <w:b w:val="0"/>
+                <w:sz w:val="18"/>
+              </w:rPr>
+              <w:t>week-04/Week_04_Storage_Databases_Runbook.docx</w:t>
+            </w:r>
+          </w:p>
+        </w:tc>
+      </w:tr>
+    </w:tbl>
+    <w:p>
+      <w:pPr>
+        <w:spacing w:after="20"/>
+      </w:pPr>
     </w:p>
     <w:p>
       <w:pPr>
         <w:pStyle w:val="Heading1"/>
       </w:pPr>
       <w:r>
-        <w:t>9. Evidence Screenshots</w:t>
-      </w:r>
-    </w:p>
-    <w:p>
-      <w:pPr>
-        <w:pStyle w:val="ListBullet"/>
-      </w:pPr>
-      <w:r>
-        <w:t>DynamoDB table creation page showing Properties and partition key L_ListingID.</w:t>
-      </w:r>
-    </w:p>
-    <w:p>
-      <w:pPr>
-        <w:pStyle w:val="ListBullet"/>
-      </w:pPr>
-      <w:r>
-        <w:t>DynamoDB Create item form showing the sample item attributes.</w:t>
-      </w:r>
-    </w:p>
-    <w:p>
-      <w:pPr>
-        <w:pStyle w:val="ListBullet"/>
-      </w:pPr>
-      <w:r>
-        <w:t>EC2 Instances page showing week4-rds-client running and 3/3 status checks passed, and role attachment.</w:t>
-      </w:r>
-    </w:p>
-    <w:p>
-      <w:pPr>
-        <w:pStyle w:val="ListBullet"/>
-      </w:pPr>
-      <w:r>
-        <w:t>Terminal output showing the successful DynamoDB get-item response.</w:t>
-      </w:r>
-    </w:p>
-    <w:p>
-      <w:pPr>
-        <w:pStyle w:val="ListBullet"/>
-      </w:pPr>
-      <w:r>
-        <w:t>Terminal output showing S3 bucket creation, runbook upload, and aws s3 ls output.</w:t>
-      </w:r>
-    </w:p>
-    <w:p>
-      <w:pPr>
-        <w:pStyle w:val="ListBullet"/>
-      </w:pPr>
-      <w:r>
-        <w:t>S3 lifecycle configuration showing archive-after-30-days enabled.</w:t>
-      </w:r>
-    </w:p>
-    <w:p>
-      <w:pPr>
-        <w:pStyle w:val="ListBullet"/>
-      </w:pPr>
-      <w:r>
-        <w:t>S3 bucket deletion success page showing 0 buckets.</w:t>
-      </w:r>
-    </w:p>
-    <w:p>
-      <w:pPr>
-        <w:pStyle w:val="ListBullet"/>
-      </w:pPr>
-      <w:r>
-        <w:t>Capture final RDS and DynamoDB absence, and EC2 Terminated state, if those screenshots have not yet been saved.</w:t>
-      </w:r>
-    </w:p>
-    <w:p>
-      <w:pPr>
-        <w:pStyle w:val="Heading1"/>
-      </w:pPr>
-      <w:r>
-        <w:t>10. Week 4 Deliverables</w:t>
-      </w:r>
-    </w:p>
-    <w:p>
-      <w:pPr>
-        <w:pStyle w:val="ListBullet"/>
-      </w:pPr>
-      <w:r>
-        <w:t>week-04/decision-guide.md</w:t>
-      </w:r>
-    </w:p>
-    <w:p>
-      <w:pPr>
-        <w:pStyle w:val="ListBullet"/>
-      </w:pPr>
-      <w:r>
-        <w:t>week-04/runbook.md (this document, after copying/adapting it to Markdown)</w:t>
-      </w:r>
-    </w:p>
-    <w:p>
-      <w:pPr>
-        <w:pStyle w:val="ListBullet"/>
-      </w:pPr>
-      <w:r>
-        <w:t>Screenshots showing resource creation, test results, lifecycle configuration, and cleanup.</w:t>
-      </w:r>
-    </w:p>
-    <w:p>
-      <w:pPr>
-        <w:pStyle w:val="Heading1"/>
-      </w:pPr>
-      <w:r>
-        <w:t>11. Week 4 Summary</w:t>
-      </w:r>
-    </w:p>
-    <w:p>
-      <w:pPr>
-        <w:pStyle w:val="ListBullet"/>
-      </w:pPr>
-      <w:r>
-        <w:t>Connected from an EC2 client to an RDS MySQL database over port 3306.</w:t>
-      </w:r>
-    </w:p>
-    <w:p>
-      <w:pPr>
-        <w:pStyle w:val="ListBullet"/>
-      </w:pPr>
-      <w:r>
-        <w:t>Created a training_data database; no SQL dump import was completed in the recorded work.</w:t>
-      </w:r>
-    </w:p>
-    <w:p>
-      <w:pPr>
-        <w:pStyle w:val="ListBullet"/>
-      </w:pPr>
-      <w:r>
-        <w:t>Created a DynamoDB Properties table and verified a sample item using the AWS CLI.</w:t>
-      </w:r>
-    </w:p>
-    <w:p>
-      <w:pPr>
-        <w:pStyle w:val="ListBullet"/>
-      </w:pPr>
-      <w:r>
-        <w:t>Created an S3 bucket, uploaded runbook.md, and configured a Glacier Flexible Retrieval lifecycle transition.</w:t>
-      </w:r>
-    </w:p>
-    <w:p>
-      <w:pPr>
-        <w:pStyle w:val="ListBullet"/>
-      </w:pPr>
-      <w:r>
-        <w:t>Deleted the S3 object and bucket to avoid leaving storage resources behind.</w:t>
-      </w:r>
-    </w:p>
-    <w:p>
-      <w:pPr>
-        <w:pStyle w:val="ListBullet"/>
-      </w:pPr>
-      <w:r>
-        <w:t>Initiated cleanup of DynamoDB, RDS, and EC2; final deletion states should be verified before documenting them as fully complete.</w:t>
-      </w:r>
-    </w:p>
-    <w:p>
-      <w:pPr>
-        <w:pStyle w:val="Heading1"/>
-      </w:pPr>
-      <w:r>
-        <w:t>GitHub Safety Note</w:t>
+        <w:t>9. Summary</w:t>
       </w:r>
     </w:p>
     <w:p>
       <w:r>
-        <w:t>Do not commit the raw rets_property.sql dump. It is large and contains identifying property and agent information. Do not commit passwords, AWS access keys, private keys, or other credentials. Keep only the runbook, decision guide, and sanitized evidence in the repository.</w:t>
+        <w:t>Week 4 provided hands-on practice with Amazon S3 (object storage and lifecycle management), Amazon RDS (managed MySQL connectivity), and Amazon DynamoDB (NoSQL access and item retrieval). The main lessons were least privilege, sensitive-data protection, verification, and cost-aware cleanup.</w:t>
       </w:r>
     </w:p>
     <w:sectPr>
+      <w:footerReference w:type="default" r:id="rId9"/>
       <w:pgSz w:w="12240" w:h="15840"/>
-      <w:pgMar w:top="1008" w:right="1152" w:bottom="1008" w:left="1152" w:header="720" w:footer="720" w:gutter="0"/>
+      <w:pgMar w:top="936" w:right="1080" w:bottom="936" w:left="1080" w:header="720" w:footer="720" w:gutter="0"/>
       <w:cols w:space="720"/>
       <w:docGrid w:linePitch="360"/>
     </w:sectPr>
   </w:body>
 </w:document>
+</file>
+
+<file path=word/footer1.xml><?xml version="1.0" encoding="utf-8"?>
+<w:ftr xmlns:m="http://schemas.openxmlformats.org/officeDocument/2006/math" xmlns:mc="http://schemas.openxmlformats.org/markup-compatibility/2006" xmlns:mo="http://schemas.microsoft.com/office/mac/office/2008/main" xmlns:mv="urn:schemas-microsoft-com:mac:vml" xmlns:o="urn:schemas-microsoft-com:office:office" xmlns:r="http://schemas.openxmlformats.org/officeDocument/2006/relationships" xmlns:v="urn:schemas-microsoft-com:vml" xmlns:w10="urn:schemas-microsoft-com:office:word" xmlns:w14="http://schemas.microsoft.com/office/word/2010/wordml" xmlns:w="http://schemas.openxmlformats.org/wordprocessingml/2006/main" xmlns:wne="http://schemas.microsoft.com/office/word/2006/wordml" xmlns:wp14="http://schemas.microsoft.com/office/word/2010/wordprocessingDrawing" xmlns:wp="http://schemas.openxmlformats.org/drawingml/2006/wordprocessingDrawing" xmlns:wpc="http://schemas.microsoft.com/office/word/2010/wordprocessingCanvas" xmlns:wpg="http://schemas.microsoft.com/office/word/2010/wordprocessingGroup" xmlns:wpi="http://schemas.microsoft.com/office/word/2010/wordprocessingInk" xmlns:wps="http://schemas.microsoft.com/office/word/2010/wordprocessingShape" mc:Ignorable="w14 wp14">
+  <w:p>
+    <w:pPr>
+      <w:pStyle w:val="Footer"/>
+      <w:jc w:val="center"/>
+    </w:pPr>
+    <w:r>
+      <w:rPr>
+        <w:color w:val="646E78"/>
+        <w:sz w:val="16"/>
+      </w:rPr>
+      <w:t>AWS Cloud Engineer Internship  •  Week 04  •  PropertyLite</w:t>
+    </w:r>
+  </w:p>
+</w:ftr>
 </file>
 
 <file path=word/numbering.xml><?xml version="1.0" encoding="utf-8"?>
@@ -1283,10 +2489,13 @@
     <w:name w:val="Normal"/>
     <w:qFormat/>
     <w:rsid w:val="00FC693F"/>
+    <w:pPr>
+      <w:spacing w:after="100"/>
+    </w:pPr>
     <w:rPr>
-      <w:rFonts w:ascii="Calibri" w:hAnsi="Calibri"/>
-      <w:color w:val="28303A"/>
-      <w:sz w:val="21"/>
+      <w:rFonts w:ascii="Aptos" w:hAnsi="Aptos"/>
+      <w:color w:val="2D3741"/>
+      <w:sz w:val="20"/>
     </w:rPr>
   </w:style>
   <w:style w:type="paragraph" w:styleId="Header">
@@ -1348,11 +2557,11 @@
       <w:outlineLvl w:val="0"/>
     </w:pPr>
     <w:rPr>
-      <w:rFonts w:asciiTheme="majorHAnsi" w:eastAsiaTheme="majorEastAsia" w:hAnsiTheme="majorHAnsi" w:cstheme="majorBidi" w:ascii="Segoe Print" w:hAnsi="Segoe Print"/>
+      <w:rFonts w:asciiTheme="majorHAnsi" w:eastAsiaTheme="majorEastAsia" w:hAnsiTheme="majorHAnsi" w:cstheme="majorBidi" w:ascii="Aptos Display" w:hAnsi="Aptos Display"/>
       <w:b/>
       <w:bCs/>
-      <w:color w:val="23537A"/>
-      <w:sz w:val="32"/>
+      <w:color w:val="143F69"/>
+      <w:sz w:val="34"/>
       <w:szCs w:val="28"/>
     </w:rPr>
   </w:style>
@@ -1372,10 +2581,10 @@
       <w:outlineLvl w:val="1"/>
     </w:pPr>
     <w:rPr>
-      <w:rFonts w:asciiTheme="majorHAnsi" w:eastAsiaTheme="majorEastAsia" w:hAnsiTheme="majorHAnsi" w:cstheme="majorBidi" w:ascii="Segoe Print" w:hAnsi="Segoe Print"/>
+      <w:rFonts w:asciiTheme="majorHAnsi" w:eastAsiaTheme="majorEastAsia" w:hAnsiTheme="majorHAnsi" w:cstheme="majorBidi" w:ascii="Aptos Display" w:hAnsi="Aptos Display"/>
       <w:b/>
       <w:bCs/>
-      <w:color w:val="23537A"/>
+      <w:color w:val="007096"/>
       <w:sz w:val="24"/>
       <w:szCs w:val="26"/>
     </w:rPr>
@@ -1396,10 +2605,11 @@
       <w:outlineLvl w:val="2"/>
     </w:pPr>
     <w:rPr>
-      <w:rFonts w:asciiTheme="majorHAnsi" w:eastAsiaTheme="majorEastAsia" w:hAnsiTheme="majorHAnsi" w:cstheme="majorBidi"/>
+      <w:rFonts w:asciiTheme="majorHAnsi" w:eastAsiaTheme="majorEastAsia" w:hAnsiTheme="majorHAnsi" w:cstheme="majorBidi" w:ascii="Aptos Display" w:hAnsi="Aptos Display"/>
       <w:b/>
       <w:bCs/>
-      <w:color w:val="4F81BD" w:themeColor="accent1"/>
+      <w:color w:val="324B5A"/>
+      <w:sz w:val="20"/>
     </w:rPr>
   </w:style>
   <w:style w:type="paragraph" w:styleId="Heading4">
@@ -1637,11 +2847,12 @@
       <w:contextualSpacing/>
     </w:pPr>
     <w:rPr>
-      <w:rFonts w:asciiTheme="majorHAnsi" w:eastAsiaTheme="majorEastAsia" w:hAnsiTheme="majorHAnsi" w:cstheme="majorBidi" w:ascii="Segoe Print" w:hAnsi="Segoe Print"/>
-      <w:color w:val="23537A"/>
+      <w:rFonts w:asciiTheme="majorHAnsi" w:eastAsiaTheme="majorEastAsia" w:hAnsiTheme="majorHAnsi" w:cstheme="majorBidi" w:ascii="Aptos Display" w:hAnsi="Aptos Display"/>
+      <w:b/>
+      <w:color w:val="143F69"/>
       <w:spacing w:val="5"/>
       <w:kern w:val="28"/>
-      <w:sz w:val="46"/>
+      <w:sz w:val="52"/>
       <w:szCs w:val="52"/>
     </w:rPr>
   </w:style>

</xml_diff>